<commit_message>
Added some stuff to limitations part
</commit_message>
<xml_diff>
--- a/report/Evaluating_KIU_Internship_Support_BRMT_FinalProject.docx
+++ b/report/Evaluating_KIU_Internship_Support_BRMT_FinalProject.docx
@@ -5974,27 +5974,47 @@
     </w:p>
     <w:p>
       <w:pPr>
-        <w:spacing w:after="120" w:line="360" w:lineRule="auto"/>
-        <w:jc w:val="both"/>
-      </w:pPr>
-      <w:r>
-        <w:t xml:space="preserve">Several limitations qualify these findings. The convenience sample is heavily weighted toward 3rd-year Computer Science students, so the perceptions of Management and Mathematics students — and of 2nd- and 4th-year students — are represented by small subgroups. The cross-sectional design means the user/non-user difference in readiness is an association, not proof that services caused higher readiness; more confident or proactive students may simply be more likely both to use services and to feel ready (self-selection). All measures are self-reported perceptions rather than actual placement outcomes. The instrument was custom-built and only minimally piloted (two test respondents), so its validity beyond acceptable internal consistency (α = .77 for both composites) is not established. Finally, the study covers a single small institution, which limits </w:t>
-      </w:r>
-      <w:proofErr w:type="spellStart"/>
-      <w:r>
-        <w:t>generalisability</w:t>
-      </w:r>
-      <w:proofErr w:type="spellEnd"/>
-      <w:r>
-        <w:t xml:space="preserve"> — although single-institution evidence was precisely the gap the study set out to fill.</w:t>
-      </w:r>
-    </w:p>
-    <w:p>
-      <w:pPr>
         <w:pStyle w:val="Heading2"/>
         <w:spacing w:before="220" w:after="120" w:line="360" w:lineRule="auto"/>
+        <w:rPr>
+          <w:color w:val="auto"/>
+          <w:sz w:val="24"/>
+          <w:szCs w:val="24"/>
+        </w:rPr>
       </w:pPr>
       <w:bookmarkStart w:id="30" w:name="_Toc234495293"/>
+      <w:r>
+        <w:rPr>
+          <w:color w:val="auto"/>
+          <w:sz w:val="24"/>
+          <w:szCs w:val="24"/>
+        </w:rPr>
+        <w:t xml:space="preserve">Several limitations qualify these findings. Although the final sample of 122 students is useful for an exploratory study, it remains relatively small compared with the full KIU undergraduate population, so estimates and subgroup patterns should be interpreted cautiously rather than treated as definitive. The convenience sample is heavily weighted toward 3rd-year Computer Science students, so the perceptions of Management and Mathematics students — and of 2nd- and 4th-year students — are represented by small subgroups. The cross-sectional design means the user/non-user difference in readiness is an association, not proof that services caused higher readiness; more confident or proactive students may simply be more likely both to use services and to feel ready (self-selection). All measures are self-reported perceptions rather than actual placement outcomes. The instrument was custom-built and only minimally piloted (two test respondents), so its validity beyond acceptable internal consistency (α = .77 for both composites) is not established. Finally, the study covers a single small institution, which limits </w:t>
+      </w:r>
+      <w:proofErr w:type="spellStart"/>
+      <w:r>
+        <w:rPr>
+          <w:color w:val="auto"/>
+          <w:sz w:val="24"/>
+          <w:szCs w:val="24"/>
+        </w:rPr>
+        <w:t>generalisability</w:t>
+      </w:r>
+      <w:proofErr w:type="spellEnd"/>
+      <w:r>
+        <w:rPr>
+          <w:color w:val="auto"/>
+          <w:sz w:val="24"/>
+          <w:szCs w:val="24"/>
+        </w:rPr>
+        <w:t xml:space="preserve"> — although single-institution evidence was precisely the gap the study set out to fill.</w:t>
+      </w:r>
+    </w:p>
+    <w:p>
+      <w:pPr>
+        <w:pStyle w:val="Heading2"/>
+        <w:spacing w:before="220" w:after="120" w:line="360" w:lineRule="auto"/>
+      </w:pPr>
       <w:r>
         <w:rPr>
           <w:b/>
@@ -6013,11 +6033,8 @@
         <w:jc w:val="both"/>
       </w:pPr>
       <w:r>
-        <w:t xml:space="preserve">The practical implications are straightforward and largely inexpensive. Because the dominant barrier is awareness, the highest-return improvements are promotional and structural rather than resource-intensive: earlier and more visible communication of opportunities (the top student priority, chosen by 38.5%), and a single central internship platform (chosen by 21.3%) so </w:t>
-      </w:r>
-      <w:r>
         <w:lastRenderedPageBreak/>
-        <w:t xml:space="preserve">information does not depend on students noticing an email. Because service use is associated with higher readiness, raising </w:t>
+        <w:t xml:space="preserve">The practical implications are straightforward and largely inexpensive. Because the dominant barrier is awareness, the highest-return improvements are promotional and structural rather than resource-intensive: earlier and more visible communication of opportunities (the top student priority, chosen by 38.5%), and a single central internship platform (chosen by 21.3%) so information does not depend on students noticing an email. Because service use is associated with higher readiness, raising </w:t>
       </w:r>
       <w:proofErr w:type="spellStart"/>
       <w:r>
@@ -6121,6 +6138,7 @@
         <w:jc w:val="both"/>
       </w:pPr>
       <w:r>
+        <w:lastRenderedPageBreak/>
         <w:t>The study’s main recommendation is that KIU invest first in visibility — earlier communication and a central internship platform — and second in hands-on preparation and field-specific opportunities. Future research should test these improvements with a pre–post design to move from association to causal evidence.</w:t>
       </w:r>
     </w:p>
@@ -6138,7 +6156,6 @@
           <w:sz w:val="28"/>
           <w:szCs w:val="28"/>
         </w:rPr>
-        <w:lastRenderedPageBreak/>
         <w:t>References</w:t>
       </w:r>
       <w:bookmarkEnd w:id="33"/>
@@ -6254,6 +6271,7 @@
         <w:ind w:left="480" w:hanging="480"/>
       </w:pPr>
       <w:r>
+        <w:lastRenderedPageBreak/>
         <w:t xml:space="preserve">[10] J. Gault, J. Redington, and T. Schlager, “Undergraduate business internships and career success: Are they </w:t>
       </w:r>
       <w:proofErr w:type="gramStart"/>
@@ -6271,7 +6289,6 @@
         <w:ind w:left="480" w:hanging="480"/>
       </w:pPr>
       <w:r>
-        <w:lastRenderedPageBreak/>
         <w:t>[11] National Association of Colleges and Employers, “What is career readiness?” NACE. [Online]. Available: https://www.naceweb.org/career-readiness/competencies/career-readiness-defined</w:t>
       </w:r>
     </w:p>
@@ -9428,7 +9445,6 @@
   <w:style w:type="character" w:default="1" w:styleId="DefaultParagraphFont">
     <w:name w:val="Default Paragraph Font"/>
     <w:uiPriority w:val="1"/>
-    <w:semiHidden/>
     <w:unhideWhenUsed/>
   </w:style>
   <w:style w:type="table" w:default="1" w:styleId="TableNormal">

</xml_diff>

<commit_message>
Changes to figure images
</commit_message>
<xml_diff>
--- a/report/Evaluating_KIU_Internship_Support_BRMT_FinalProject.docx
+++ b/report/Evaluating_KIU_Internship_Support_BRMT_FinalProject.docx
@@ -160,7 +160,15 @@
       </w:r>
       <w:proofErr w:type="spellEnd"/>
       <w:r>
-        <w:t xml:space="preserve"> using descriptive statistics and a Welch independent-samples t-test. Awareness of the services was low to moderate (M = 2.92 on a 5-point scale) and only 31.1% of respondents had used them, most commonly citing not knowing the services existed. Students who had used support services reported significantly higher perceived internship readiness than non-users, t(88.1) = 3.36, p = .001, d = 0.60, so the null hypothesis was rejected. Among users, satisfaction was modest overall, with CV and interview preparation support rated lowest. The results suggest that KIU’s internship support is potentially valuable but under-promoted, and the study recommends earlier and more visible communication, a central internship information platform, and stronger field-specific opportunities.</w:t>
+        <w:t xml:space="preserve"> using descriptive statistics and a Welch independent-samples t-test. Awareness of the services was low to moderate (M = 2.92 on a 5-point scale) and only 31.1% of respondents had used them, most commonly citing not knowing the services existed. Students who had used support services reported significantly higher perceived internship readiness than non-users, </w:t>
+      </w:r>
+      <w:proofErr w:type="gramStart"/>
+      <w:r>
+        <w:t>t(</w:t>
+      </w:r>
+      <w:proofErr w:type="gramEnd"/>
+      <w:r>
+        <w:t>88.1) = 3.36, p = .001, d = 0.60, so the null hypothesis was rejected. Among users, satisfaction was modest overall, with CV and interview preparation support rated lowest. The results suggest that KIU’s internship support is potentially valuable but under-promoted, and the study recommends earlier and more visible communication, a central internship information platform, and stronger field-specific opportunities.</w:t>
       </w:r>
     </w:p>
     <w:p>
@@ -1830,7 +1838,7 @@
               <w:rPr>
                 <w:noProof/>
               </w:rPr>
-              <w:t>12</w:t>
+              <w:t>13</w:t>
             </w:r>
             <w:r>
               <w:rPr>
@@ -1893,7 +1901,7 @@
               <w:rPr>
                 <w:noProof/>
               </w:rPr>
-              <w:t>12</w:t>
+              <w:t>13</w:t>
             </w:r>
             <w:r>
               <w:rPr>
@@ -1956,7 +1964,7 @@
               <w:rPr>
                 <w:noProof/>
               </w:rPr>
-              <w:t>12</w:t>
+              <w:t>13</w:t>
             </w:r>
             <w:r>
               <w:rPr>
@@ -2019,7 +2027,7 @@
               <w:rPr>
                 <w:noProof/>
               </w:rPr>
-              <w:t>13</w:t>
+              <w:t>14</w:t>
             </w:r>
             <w:r>
               <w:rPr>
@@ -2082,7 +2090,7 @@
               <w:rPr>
                 <w:noProof/>
               </w:rPr>
-              <w:t>13</w:t>
+              <w:t>14</w:t>
             </w:r>
             <w:r>
               <w:rPr>
@@ -2145,7 +2153,7 @@
               <w:rPr>
                 <w:noProof/>
               </w:rPr>
-              <w:t>13</w:t>
+              <w:t>14</w:t>
             </w:r>
             <w:r>
               <w:rPr>
@@ -2208,7 +2216,7 @@
               <w:rPr>
                 <w:noProof/>
               </w:rPr>
-              <w:t>14</w:t>
+              <w:t>15</w:t>
             </w:r>
             <w:r>
               <w:rPr>
@@ -2271,7 +2279,7 @@
               <w:rPr>
                 <w:noProof/>
               </w:rPr>
-              <w:t>14</w:t>
+              <w:t>15</w:t>
             </w:r>
             <w:r>
               <w:rPr>
@@ -2334,7 +2342,7 @@
               <w:rPr>
                 <w:noProof/>
               </w:rPr>
-              <w:t>15</w:t>
+              <w:t>16</w:t>
             </w:r>
             <w:r>
               <w:rPr>
@@ -2397,7 +2405,7 @@
               <w:rPr>
                 <w:noProof/>
               </w:rPr>
-              <w:t>17</w:t>
+              <w:t>18</w:t>
             </w:r>
             <w:r>
               <w:rPr>
@@ -2460,7 +2468,7 @@
               <w:rPr>
                 <w:noProof/>
               </w:rPr>
-              <w:t>17</w:t>
+              <w:t>18</w:t>
             </w:r>
             <w:r>
               <w:rPr>
@@ -2523,7 +2531,7 @@
               <w:rPr>
                 <w:noProof/>
               </w:rPr>
-              <w:t>17</w:t>
+              <w:t>18</w:t>
             </w:r>
             <w:r>
               <w:rPr>
@@ -2586,7 +2594,7 @@
               <w:rPr>
                 <w:noProof/>
               </w:rPr>
-              <w:t>17</w:t>
+              <w:t>18</w:t>
             </w:r>
             <w:r>
               <w:rPr>
@@ -2649,7 +2657,7 @@
               <w:rPr>
                 <w:noProof/>
               </w:rPr>
-              <w:t>17</w:t>
+              <w:t>18</w:t>
             </w:r>
             <w:r>
               <w:rPr>
@@ -2712,7 +2720,7 @@
               <w:rPr>
                 <w:noProof/>
               </w:rPr>
-              <w:t>17</w:t>
+              <w:t>18</w:t>
             </w:r>
             <w:r>
               <w:rPr>
@@ -2775,7 +2783,7 @@
               <w:rPr>
                 <w:noProof/>
               </w:rPr>
-              <w:t>18</w:t>
+              <w:t>19</w:t>
             </w:r>
             <w:r>
               <w:rPr>
@@ -2838,7 +2846,7 @@
               <w:rPr>
                 <w:noProof/>
               </w:rPr>
-              <w:t>18</w:t>
+              <w:t>19</w:t>
             </w:r>
             <w:r>
               <w:rPr>
@@ -2901,7 +2909,7 @@
               <w:rPr>
                 <w:noProof/>
               </w:rPr>
-              <w:t>18</w:t>
+              <w:t>19</w:t>
             </w:r>
             <w:r>
               <w:rPr>
@@ -2964,7 +2972,7 @@
               <w:rPr>
                 <w:noProof/>
               </w:rPr>
-              <w:t>18</w:t>
+              <w:t>19</w:t>
             </w:r>
             <w:r>
               <w:rPr>
@@ -3027,7 +3035,7 @@
               <w:rPr>
                 <w:noProof/>
               </w:rPr>
-              <w:t>19</w:t>
+              <w:t>20</w:t>
             </w:r>
             <w:r>
               <w:rPr>
@@ -3090,7 +3098,7 @@
               <w:rPr>
                 <w:noProof/>
               </w:rPr>
-              <w:t>20</w:t>
+              <w:t>21</w:t>
             </w:r>
             <w:r>
               <w:rPr>
@@ -3143,6 +3151,11 @@
       <w:pPr>
         <w:spacing w:after="120" w:line="360" w:lineRule="auto"/>
       </w:pPr>
+    </w:p>
+    <w:p>
+      <w:pPr>
+        <w:spacing w:after="120" w:line="360" w:lineRule="auto"/>
+      </w:pPr>
       <w:r>
         <w:t>Table 2. Service-evaluation ratings among support users (n = 38)</w:t>
       </w:r>
@@ -3151,9 +3164,19 @@
       <w:pPr>
         <w:spacing w:after="120" w:line="360" w:lineRule="auto"/>
       </w:pPr>
+    </w:p>
+    <w:p>
+      <w:pPr>
+        <w:spacing w:after="120" w:line="360" w:lineRule="auto"/>
+      </w:pPr>
       <w:r>
         <w:t>Table 3. Welch t-test: readiness score by service usage</w:t>
       </w:r>
+    </w:p>
+    <w:p>
+      <w:pPr>
+        <w:spacing w:after="120" w:line="360" w:lineRule="auto"/>
+      </w:pPr>
     </w:p>
     <w:p>
       <w:pPr>
@@ -3178,7 +3201,7 @@
         <w:spacing w:after="120" w:line="360" w:lineRule="auto"/>
       </w:pPr>
       <w:r>
-        <w:t>Figure 1. Mean service-evaluation ratings among support users (n = 38)</w:t>
+        <w:t xml:space="preserve">Figure 1. Mean service-evaluation ratings among support users </w:t>
       </w:r>
     </w:p>
     <w:p>
@@ -3186,8 +3209,35 @@
         <w:spacing w:after="120" w:line="360" w:lineRule="auto"/>
       </w:pPr>
       <w:r>
+        <w:t>(n = 38</w:t>
+      </w:r>
+      <w:r>
+        <w:t xml:space="preserve">, the dotted line represents </w:t>
+      </w:r>
+      <w:r>
+        <w:t>scale midpoint</w:t>
+      </w:r>
+      <w:r>
+        <w:t>)</w:t>
+      </w:r>
+    </w:p>
+    <w:p>
+      <w:pPr>
+        <w:spacing w:after="120" w:line="360" w:lineRule="auto"/>
+      </w:pPr>
+    </w:p>
+    <w:p>
+      <w:pPr>
+        <w:spacing w:after="120" w:line="360" w:lineRule="auto"/>
+      </w:pPr>
+      <w:r>
         <w:t>Figure 2. Mean readiness score by service usage (error bars show ± 1 SD)</w:t>
       </w:r>
+    </w:p>
+    <w:p>
+      <w:pPr>
+        <w:spacing w:after="120" w:line="360" w:lineRule="auto"/>
+      </w:pPr>
     </w:p>
     <w:p>
       <w:pPr>
@@ -3200,6 +3250,15 @@
           <w:docGrid w:linePitch="360"/>
         </w:sectPr>
       </w:pPr>
+      <w:r>
+        <w:t>Figure 3.</w:t>
+      </w:r>
+      <w:r>
+        <w:t xml:space="preserve"> </w:t>
+      </w:r>
+      <w:r>
+        <w:t>Improvement Priorities Among Respondents</w:t>
+      </w:r>
     </w:p>
     <w:p>
       <w:pPr>
@@ -3472,10 +3531,12 @@
         <w:t xml:space="preserve">psychological — to stay competitive [1], [5]. Where USEM </w:t>
       </w:r>
       <w:proofErr w:type="spellStart"/>
+      <w:proofErr w:type="gramStart"/>
       <w:r>
         <w:t>emphasises</w:t>
       </w:r>
       <w:proofErr w:type="spellEnd"/>
+      <w:proofErr w:type="gramEnd"/>
       <w:r>
         <w:t xml:space="preserve"> what universities should teach, the Graduate Capital Model </w:t>
       </w:r>
@@ -5270,15 +5331,53 @@
     <w:p>
       <w:pPr>
         <w:spacing w:before="120" w:after="120" w:line="360" w:lineRule="auto"/>
-      </w:pPr>
-      <w:r>
         <w:rPr>
           <w:b/>
           <w:bCs/>
           <w:sz w:val="22"/>
           <w:szCs w:val="22"/>
         </w:rPr>
-        <w:t>Figure 1. Mean service-evaluation ratings among support users (n = 38)</w:t>
+      </w:pPr>
+      <w:r>
+        <w:rPr>
+          <w:b/>
+          <w:bCs/>
+          <w:sz w:val="22"/>
+          <w:szCs w:val="22"/>
+        </w:rPr>
+        <w:t xml:space="preserve">Figure 1. Mean service-evaluation ratings among support users </w:t>
+      </w:r>
+    </w:p>
+    <w:p>
+      <w:pPr>
+        <w:spacing w:before="120" w:after="120" w:line="360" w:lineRule="auto"/>
+      </w:pPr>
+      <w:r>
+        <w:rPr>
+          <w:b/>
+          <w:bCs/>
+          <w:sz w:val="22"/>
+          <w:szCs w:val="22"/>
+        </w:rPr>
+        <w:t>(n = 38</w:t>
+      </w:r>
+      <w:r>
+        <w:t xml:space="preserve"> </w:t>
+      </w:r>
+      <w:r>
+        <w:t xml:space="preserve">the dotted line represents </w:t>
+      </w:r>
+      <w:r>
+        <w:t>scale midpoint</w:t>
+      </w:r>
+      <w:r>
+        <w:rPr>
+          <w:b/>
+          <w:bCs/>
+          <w:sz w:val="22"/>
+          <w:szCs w:val="22"/>
+        </w:rPr>
+        <w:t>)</w:t>
       </w:r>
     </w:p>
     <w:p>
@@ -5287,14 +5386,11 @@
         <w:jc w:val="center"/>
       </w:pPr>
       <w:r>
-        <w:rPr>
-          <w:noProof/>
-        </w:rPr>
         <w:drawing>
-          <wp:inline distT="0" distB="0" distL="0" distR="0" wp14:anchorId="2D0F089B" wp14:editId="34C9EAC4">
-            <wp:extent cx="5905500" cy="2790825"/>
-            <wp:effectExtent l="0" t="0" r="0" b="0"/>
-            <wp:docPr id="1" name="Picture 1"/>
+          <wp:inline distT="0" distB="0" distL="0" distR="0" wp14:anchorId="5DAAA60F" wp14:editId="76B46276">
+            <wp:extent cx="5354510" cy="4015740"/>
+            <wp:effectExtent l="0" t="0" r="0" b="3810"/>
+            <wp:docPr id="465137410" name="Picture 12"/>
             <wp:cNvGraphicFramePr>
               <a:graphicFrameLocks xmlns:a="http://schemas.openxmlformats.org/drawingml/2006/main" noChangeAspect="1"/>
             </wp:cNvGraphicFramePr>
@@ -5302,13 +5398,19 @@
               <a:graphicData uri="http://schemas.openxmlformats.org/drawingml/2006/picture">
                 <pic:pic xmlns:pic="http://schemas.openxmlformats.org/drawingml/2006/picture">
                   <pic:nvPicPr>
-                    <pic:cNvPr id="0" name=""/>
+                    <pic:cNvPr id="0" name="Picture 50"/>
                     <pic:cNvPicPr>
                       <a:picLocks noChangeAspect="1" noChangeArrowheads="1"/>
                     </pic:cNvPicPr>
                   </pic:nvPicPr>
                   <pic:blipFill>
-                    <a:blip r:embed="rId8"/>
+                    <a:blip r:embed="rId8">
+                      <a:extLst>
+                        <a:ext uri="{28A0092B-C50C-407E-A947-70E740481C1C}">
+                          <a14:useLocalDpi xmlns:a14="http://schemas.microsoft.com/office/drawing/2010/main" val="0"/>
+                        </a:ext>
+                      </a:extLst>
+                    </a:blip>
                     <a:srcRect/>
                     <a:stretch>
                       <a:fillRect/>
@@ -5317,11 +5419,15 @@
                   <pic:spPr bwMode="auto">
                     <a:xfrm>
                       <a:off x="0" y="0"/>
-                      <a:ext cx="5905500" cy="2790825"/>
+                      <a:ext cx="5381405" cy="4035911"/>
                     </a:xfrm>
                     <a:prstGeom prst="rect">
                       <a:avLst/>
                     </a:prstGeom>
+                    <a:noFill/>
+                    <a:ln>
+                      <a:noFill/>
+                    </a:ln>
                   </pic:spPr>
                 </pic:pic>
               </a:graphicData>
@@ -5329,6 +5435,11 @@
           </wp:inline>
         </w:drawing>
       </w:r>
+    </w:p>
+    <w:p>
+      <w:pPr>
+        <w:spacing w:after="200"/>
+      </w:pPr>
     </w:p>
     <w:p>
       <w:pPr>
@@ -5354,7 +5465,15 @@
         <w:jc w:val="both"/>
       </w:pPr>
       <w:r>
-        <w:t>Across all 122 respondents, the composite readiness score averaged M = 2.89 (SD = 0.85; Cronbach’s α = .77). Confidence was highest for CV preparation (M = 3.20) and lowest for finding internship opportunities (M = 2.60). A Shapiro–Wilk test indicated no significant departure from normality for the readiness score, W = .983, p = .130, supporting the use of parametric tests.</w:t>
+        <w:t xml:space="preserve">Across all 122 respondents, the composite readiness </w:t>
+      </w:r>
+      <w:proofErr w:type="gramStart"/>
+      <w:r>
+        <w:t>score</w:t>
+      </w:r>
+      <w:proofErr w:type="gramEnd"/>
+      <w:r>
+        <w:t xml:space="preserve"> averaged M = 2.89 (SD = 0.85; Cronbach’s α = .77). Confidence was highest for CV preparation (M = 3.20) and lowest for finding internship opportunities (M = 2.60). A Shapiro–Wilk test indicated no significant departure from normality for the readiness score, W = .983, p = .130, supporting the use of parametric tests.</w:t>
       </w:r>
     </w:p>
     <w:p>
@@ -5363,7 +5482,16 @@
         <w:jc w:val="both"/>
       </w:pPr>
       <w:r>
-        <w:t>A Welch independent-samples t-test compared readiness between service users and non-users (Table 3, Figure 2). Users reported significantly higher readiness (M = 3.23, SD = 0.70) than non-users (M = 2.74, SD = 0.87), with a mean difference of 0.50 points, 95% CI [0.20, 0.79], t(88.1) = 3.36, p = .001, d = 0.60, a medium effect. The evidence was therefore sufficient to reject H₀ at the .05 significance level: students who used KIU internship support services reported significantly higher perceived internship readiness than students who did not.</w:t>
+        <w:lastRenderedPageBreak/>
+        <w:t xml:space="preserve">A Welch independent-samples t-test compared readiness between service users and non-users (Table 3, Figure 2). Users reported significantly higher readiness (M = 3.23, SD = 0.70) than non-users (M = 2.74, SD = 0.87), with a mean difference of 0.50 points, 95% CI [0.20, 0.79], </w:t>
+      </w:r>
+      <w:proofErr w:type="gramStart"/>
+      <w:r>
+        <w:t>t(</w:t>
+      </w:r>
+      <w:proofErr w:type="gramEnd"/>
+      <w:r>
+        <w:t>88.1) = 3.36, p = .001, d = 0.60, a medium effect. The evidence was therefore sufficient to reject H₀ at the .05 significance level: students who used KIU internship support services reported significantly higher perceived internship readiness than students who did not.</w:t>
       </w:r>
     </w:p>
     <w:p>
@@ -5420,7 +5548,6 @@
                 <w:sz w:val="22"/>
                 <w:szCs w:val="22"/>
               </w:rPr>
-              <w:lastRenderedPageBreak/>
               <w:t>Group</w:t>
             </w:r>
           </w:p>
@@ -5637,7 +5764,23 @@
           <w:i/>
           <w:iCs/>
         </w:rPr>
-        <w:t>Mean difference = 0.50, 95% CI [0.20, 0.79], t(88.1) = 3.36, p = .001, Cohen’s d = 0.60.</w:t>
+        <w:t xml:space="preserve">Mean difference = 0.50, 95% CI [0.20, 0.79], </w:t>
+      </w:r>
+      <w:proofErr w:type="gramStart"/>
+      <w:r>
+        <w:rPr>
+          <w:i/>
+          <w:iCs/>
+        </w:rPr>
+        <w:t>t(</w:t>
+      </w:r>
+      <w:proofErr w:type="gramEnd"/>
+      <w:r>
+        <w:rPr>
+          <w:i/>
+          <w:iCs/>
+        </w:rPr>
+        <w:t>88.1) = 3.36, p = .001, Cohen’s d = 0.60.</w:t>
       </w:r>
     </w:p>
     <w:p>
@@ -5705,11 +5848,33 @@
     </w:p>
     <w:p>
       <w:pPr>
+        <w:spacing w:after="200"/>
+        <w:jc w:val="center"/>
+      </w:pPr>
+    </w:p>
+    <w:p>
+      <w:pPr>
         <w:spacing w:after="120" w:line="360" w:lineRule="auto"/>
         <w:jc w:val="both"/>
       </w:pPr>
       <w:r>
-        <w:t>Two exploratory correlations supported the same pattern. Awareness of the services correlated moderately and positively with readiness, r(120) = .43, p &lt; .001 (Spearman’s ρ = .44, p &lt; .001), and year of study correlated weakly and positively with readiness, r(120) = .27, p = .002 (Spearman’s ρ = .26, p = .003).</w:t>
+        <w:t xml:space="preserve">Two exploratory correlations supported the same pattern. Awareness of the services correlated moderately and positively with readiness, </w:t>
+      </w:r>
+      <w:proofErr w:type="gramStart"/>
+      <w:r>
+        <w:t>r(</w:t>
+      </w:r>
+      <w:proofErr w:type="gramEnd"/>
+      <w:r>
+        <w:t xml:space="preserve">120) = .43, p &lt; .001 (Spearman’s ρ = .44, p &lt; .001), and year of study correlated weakly and positively with readiness, </w:t>
+      </w:r>
+      <w:proofErr w:type="gramStart"/>
+      <w:r>
+        <w:t>r(</w:t>
+      </w:r>
+      <w:proofErr w:type="gramEnd"/>
+      <w:r>
+        <w:t>120) = .27, p = .002 (Spearman’s ρ = .26, p = .003).</w:t>
       </w:r>
     </w:p>
     <w:p>
@@ -5736,7 +5901,7 @@
         <w:jc w:val="both"/>
       </w:pPr>
       <w:r>
-        <w:t>When asked which single improvement would help students most, the top choice was earlier communication about internship opportunities (n = 47, 38.5%), followed by one central internship information platform (n = 26, 21.3%) and more employer and alumni networking events (n = 18, 14.8%).</w:t>
+        <w:t xml:space="preserve">When asked which single improvement would help students most, the top choice was earlier communication about internship opportunities (n = 47, 38.5%), followed by one central internship information platform (n = 26, 21.3%) </w:t>
       </w:r>
     </w:p>
     <w:p>
@@ -5745,12 +5910,86 @@
         <w:jc w:val="both"/>
       </w:pPr>
       <w:r>
-        <w:t xml:space="preserve">Of the 122 respondents, 76 described a biggest weakness and 70 offered an improvement suggestion. Thematic coding produced four themes. The first and most common theme was lack of awareness and visibility: many students simply did not know the services existed (“I think the biggest weakness is that many students are not even aware that these internship support services exist”). The second was late or infrequent communication (“Information is shared too late”). The third was limited, field-mismatched opportunities, raised especially by Management and Mathematics students (“There are very few internship opportunities related to mathematics, which </w:t>
-      </w:r>
-      <w:r>
         <w:lastRenderedPageBreak/>
-        <w:t>makes it difficult for students in this field to find relevant placements”). The fourth was a lack of practical preparation support (“we don’t get any tips on how to prepare CVs or for interviews”). Improvement suggestions mirrored these themes: more and earlier communication, a dedicated internship platform, more field-specific partnerships, and more networking events and interview practice.</w:t>
-      </w:r>
+        <w:t>Figure 3. Improvement Priorities Among Respondents</w:t>
+      </w:r>
+    </w:p>
+    <w:p>
+      <w:pPr>
+        <w:spacing w:after="120" w:line="360" w:lineRule="auto"/>
+        <w:jc w:val="both"/>
+      </w:pPr>
+      <w:r>
+        <w:drawing>
+          <wp:inline distT="0" distB="0" distL="0" distR="0" wp14:anchorId="45B2BC16" wp14:editId="59D87A01">
+            <wp:extent cx="5940425" cy="4455160"/>
+            <wp:effectExtent l="0" t="0" r="3175" b="2540"/>
+            <wp:docPr id="1785862134" name="Picture 18"/>
+            <wp:cNvGraphicFramePr>
+              <a:graphicFrameLocks xmlns:a="http://schemas.openxmlformats.org/drawingml/2006/main" noChangeAspect="1"/>
+            </wp:cNvGraphicFramePr>
+            <a:graphic xmlns:a="http://schemas.openxmlformats.org/drawingml/2006/main">
+              <a:graphicData uri="http://schemas.openxmlformats.org/drawingml/2006/picture">
+                <pic:pic xmlns:pic="http://schemas.openxmlformats.org/drawingml/2006/picture">
+                  <pic:nvPicPr>
+                    <pic:cNvPr id="0" name="Picture 71"/>
+                    <pic:cNvPicPr>
+                      <a:picLocks noChangeAspect="1" noChangeArrowheads="1"/>
+                    </pic:cNvPicPr>
+                  </pic:nvPicPr>
+                  <pic:blipFill>
+                    <a:blip r:embed="rId10">
+                      <a:extLst>
+                        <a:ext uri="{28A0092B-C50C-407E-A947-70E740481C1C}">
+                          <a14:useLocalDpi xmlns:a14="http://schemas.microsoft.com/office/drawing/2010/main" val="0"/>
+                        </a:ext>
+                      </a:extLst>
+                    </a:blip>
+                    <a:srcRect/>
+                    <a:stretch>
+                      <a:fillRect/>
+                    </a:stretch>
+                  </pic:blipFill>
+                  <pic:spPr bwMode="auto">
+                    <a:xfrm>
+                      <a:off x="0" y="0"/>
+                      <a:ext cx="5940425" cy="4455160"/>
+                    </a:xfrm>
+                    <a:prstGeom prst="rect">
+                      <a:avLst/>
+                    </a:prstGeom>
+                    <a:noFill/>
+                    <a:ln>
+                      <a:noFill/>
+                    </a:ln>
+                  </pic:spPr>
+                </pic:pic>
+              </a:graphicData>
+            </a:graphic>
+          </wp:inline>
+        </w:drawing>
+      </w:r>
+    </w:p>
+    <w:p>
+      <w:pPr>
+        <w:spacing w:after="120" w:line="360" w:lineRule="auto"/>
+        <w:jc w:val="both"/>
+      </w:pPr>
+      <w:r>
+        <w:t>Of the 122 respondents, 76 described a biggest weakness and 70 offered an improvement suggestion. Thematic coding produced four themes. The first and most common theme was lack of awareness and visibility: many students simply did not know the services existed (“I think the biggest weakness is that many students are not even aware that these internship support services exist”). The second was late or infrequent communication (“Information is shared too late”). The third was limited, field-mismatched opportunities, raised especially by Management and Mathematics students (“There are very few internship opportunities related to mathematics, which makes it difficult for students in this field to find relevant placements”). The fourth was a lack of practical preparation support (“we don’t get any tips on how to prepare CVs or for interviews”). Improvement suggestions mirrored these themes: more and earlier communication, a dedicated internship platform, more field-specific partnerships, and more networking events and interview practice.</w:t>
+      </w:r>
+    </w:p>
+    <w:p>
+      <w:pPr>
+        <w:spacing w:after="120" w:line="360" w:lineRule="auto"/>
+        <w:jc w:val="both"/>
+      </w:pPr>
+    </w:p>
+    <w:p>
+      <w:pPr>
+        <w:spacing w:after="120" w:line="360" w:lineRule="auto"/>
+        <w:jc w:val="both"/>
+      </w:pPr>
     </w:p>
     <w:p>
       <w:pPr>
@@ -5766,6 +6005,7 @@
           <w:sz w:val="28"/>
           <w:szCs w:val="28"/>
         </w:rPr>
+        <w:lastRenderedPageBreak/>
         <w:t>5. Discussion</w:t>
       </w:r>
       <w:bookmarkEnd w:id="25"/>
@@ -5854,11 +6094,7 @@
       </w:r>
       <w:proofErr w:type="spellEnd"/>
       <w:r>
-        <w:t xml:space="preserve"> and SCCT prediction that career development activities build self-efficacy and confidence [6], [9]. Third, however, the results partially contradict the pattern reported in Western studies, where students are typically </w:t>
-      </w:r>
-      <w:r>
-        <w:lastRenderedPageBreak/>
-        <w:t xml:space="preserve">most satisfied with transactional services such as CV reviews and mock interviews and least satisfied with deep </w:t>
+        <w:t xml:space="preserve"> and SCCT prediction that career development activities build self-efficacy and confidence [6], [9]. Third, however, the results partially contradict the pattern reported in Western studies, where students are typically most satisfied with transactional services such as CV reviews and mock interviews and least satisfied with deep </w:t>
       </w:r>
       <w:proofErr w:type="spellStart"/>
       <w:r>
@@ -5883,6 +6119,7 @@
           <w:sz w:val="24"/>
           <w:szCs w:val="24"/>
         </w:rPr>
+        <w:lastRenderedPageBreak/>
         <w:t>5.3 Unexpected findings</w:t>
       </w:r>
       <w:bookmarkEnd w:id="28"/>
@@ -5975,16 +6212,19 @@
         <w:jc w:val="both"/>
       </w:pPr>
       <w:r>
+        <w:t xml:space="preserve">The practical implications are straightforward and largely inexpensive. Because the dominant barrier is awareness, the highest-return improvements are promotional and structural rather than resource-intensive: earlier and more visible communication of opportunities (the top student priority, chosen by 38.5%), and a single central internship platform (chosen by 21.3%) so information does not depend on students noticing an email. Because service use is associated with higher readiness, raising </w:t>
+      </w:r>
+      <w:proofErr w:type="spellStart"/>
+      <w:r>
+        <w:t>utilisation</w:t>
+      </w:r>
+      <w:proofErr w:type="spellEnd"/>
+      <w:r>
+        <w:t xml:space="preserve"> is likely to be genuinely valuable rather than cosmetic. The second tier of improvements targets the weakest-rated services: introducing regular CV and </w:t>
+      </w:r>
+      <w:r>
         <w:lastRenderedPageBreak/>
-        <w:t xml:space="preserve">The practical implications are straightforward and largely inexpensive. Because the dominant barrier is awareness, the highest-return improvements are promotional and structural rather than resource-intensive: earlier and more visible communication of opportunities (the top student priority, chosen by 38.5%), and a single central internship platform (chosen by 21.3%) so information does not depend on students noticing an email. Because service use is associated with higher readiness, raising </w:t>
-      </w:r>
-      <w:proofErr w:type="spellStart"/>
-      <w:r>
-        <w:t>utilisation</w:t>
-      </w:r>
-      <w:proofErr w:type="spellEnd"/>
-      <w:r>
-        <w:t xml:space="preserve"> is likely to be genuinely valuable rather than cosmetic. The second tier of improvements targets the weakest-rated services: introducing regular CV and interview preparation support, and building field-specific internship partnerships for Management and Mathematics students. For theory, the study adds a small-institution, non-Western data point confirming that the satisfaction–</w:t>
+        <w:t>interview preparation support, and building field-specific internship partnerships for Management and Mathematics students. For theory, the study adds a small-institution, non-Western data point confirming that the satisfaction–</w:t>
       </w:r>
       <w:proofErr w:type="spellStart"/>
       <w:r>
@@ -6063,7 +6303,15 @@
         <w:jc w:val="both"/>
       </w:pPr>
       <w:r>
-        <w:t>The answer is two-sided. On the one hand, the services appear to matter: students who used them reported significantly higher internship readiness than those who did not (t(88.1) = 3.36, p = .001, d = 0.60), and awareness correlated positively with readiness. On the other hand, only 31.1% of students had used any service, nearly a third of non-users did not know the services existed, and users rated CV and interview preparation support as clearly inadequate. KIU’s internship support is therefore best described as promising but under-promoted and underdeveloped in practical preparation.</w:t>
+        <w:t>The answer is two-sided. On the one hand, the services appear to matter: students who used them reported significantly higher internship readiness than those who did not (</w:t>
+      </w:r>
+      <w:proofErr w:type="gramStart"/>
+      <w:r>
+        <w:t>t(</w:t>
+      </w:r>
+      <w:proofErr w:type="gramEnd"/>
+      <w:r>
+        <w:t>88.1) = 3.36, p = .001, d = 0.60), and awareness correlated positively with readiness. On the other hand, only 31.1% of students had used any service, nearly a third of non-users did not know the services existed, and users rated CV and interview preparation support as clearly inadequate. KIU’s internship support is therefore best described as promising but under-promoted and underdeveloped in practical preparation.</w:t>
       </w:r>
     </w:p>
     <w:p>
@@ -6072,9 +6320,20 @@
         <w:jc w:val="both"/>
       </w:pPr>
       <w:r>
-        <w:lastRenderedPageBreak/>
         <w:t>The study’s main recommendation is that KIU invest first in visibility — earlier communication and a central internship platform — and second in hands-on preparation and field-specific opportunities. Future research should test these improvements with a pre–post design to move from association to causal evidence.</w:t>
       </w:r>
+    </w:p>
+    <w:p>
+      <w:pPr>
+        <w:spacing w:after="120" w:line="360" w:lineRule="auto"/>
+        <w:jc w:val="both"/>
+      </w:pPr>
+    </w:p>
+    <w:p>
+      <w:pPr>
+        <w:spacing w:after="120" w:line="360" w:lineRule="auto"/>
+        <w:jc w:val="both"/>
+      </w:pPr>
     </w:p>
     <w:p>
       <w:pPr>
@@ -6090,6 +6349,7 @@
           <w:sz w:val="28"/>
           <w:szCs w:val="28"/>
         </w:rPr>
+        <w:lastRenderedPageBreak/>
         <w:t>References</w:t>
       </w:r>
       <w:bookmarkEnd w:id="33"/>
@@ -6205,8 +6465,15 @@
         <w:ind w:left="480" w:hanging="480"/>
       </w:pPr>
       <w:r>
-        <w:lastRenderedPageBreak/>
-        <w:t>[10] J. Gault, J. Redington, and T. Schlager, “Undergraduate business internships and career success: Are they related?,” Journal of Marketing Education, vol. 22, no. 1, pp. 45–53, 2000.</w:t>
+        <w:t xml:space="preserve">[10] J. Gault, J. Redington, and T. Schlager, “Undergraduate business internships and career success: Are they </w:t>
+      </w:r>
+      <w:proofErr w:type="gramStart"/>
+      <w:r>
+        <w:t>related?,</w:t>
+      </w:r>
+      <w:proofErr w:type="gramEnd"/>
+      <w:r>
+        <w:t>” Journal of Marketing Education, vol. 22, no. 1, pp. 45–53, 2000.</w:t>
       </w:r>
     </w:p>
     <w:p>
@@ -6215,6 +6482,7 @@
         <w:ind w:left="480" w:hanging="480"/>
       </w:pPr>
       <w:r>
+        <w:lastRenderedPageBreak/>
         <w:t>[11] National Association of Colleges and Employers, “What is career readiness?” NACE. [Online]. Available: https://www.naceweb.org/career-readiness/competencies/career-readiness-defined</w:t>
       </w:r>
     </w:p>
@@ -6248,7 +6516,15 @@
         <w:t xml:space="preserve">Sarah Vines and Matthias S. Gobel, </w:t>
       </w:r>
       <w:r>
-        <w:t>“Levelling the playing field? How social class and internships influence perceived employability amongst UK university students,” Studies in Higher Education, 2025</w:t>
+        <w:t xml:space="preserve">“Levelling the playing field? How social class and internships influence perceived employability amongst UK </w:t>
+      </w:r>
+      <w:proofErr w:type="gramStart"/>
+      <w:r>
+        <w:t>university</w:t>
+      </w:r>
+      <w:proofErr w:type="gramEnd"/>
+      <w:r>
+        <w:t xml:space="preserve"> students,” Studies in Higher Education, 2025</w:t>
       </w:r>
       <w:r>
         <w:t>.</w:t>
@@ -6296,13 +6572,7 @@
         <w:t>“The impact of service quality on students’ satisfaction in higher education: An empirical investigation,” International Journal of Research and Innovation in Social Science, 2024.</w:t>
       </w:r>
       <w:r>
-        <w:t xml:space="preserve"> </w:t>
-      </w:r>
-      <w:r>
-        <w:t>[Online]. Available:</w:t>
-      </w:r>
-      <w:r>
-        <w:t xml:space="preserve"> </w:t>
+        <w:t xml:space="preserve"> [Online]. Available: </w:t>
       </w:r>
       <w:r>
         <w:t>https://www.researchgate.net/profile/Romita-Devi-De</w:t>
@@ -8687,7 +8957,7 @@
     </w:tbl>
     <w:p/>
     <w:sectPr>
-      <w:footerReference w:type="default" r:id="rId10"/>
+      <w:footerReference w:type="default" r:id="rId11"/>
       <w:pgSz w:w="11906" w:h="16838"/>
       <w:pgMar w:top="1417" w:right="850" w:bottom="1417" w:left="1701" w:header="708" w:footer="708" w:gutter="0"/>
       <w:pgNumType w:start="1"/>

</xml_diff>